<commit_message>
Add descriptions to Dart practicum report
Co-authored-by: Copilot <223556219+Copilot@users.noreply.github.com>
</commit_message>
<xml_diff>
--- a/Yusuf Al Fikri Jayasena LAPORAN PRAKTIKUM PEMROGRAMAN.docx
+++ b/Yusuf Al Fikri Jayasena LAPORAN PRAKTIKUM PEMROGRAMAN.docx
@@ -1,5 +1,55 @@
 
-<file path=word/document.xml><?xml version="1.0" encoding="utf-8"?>
+<file path=docProps\app.xml><?xml version="1.0" encoding="utf-8"?>
+<Properties xmlns="http://schemas.openxmlformats.org/officeDocument/2006/extended-properties" xmlns:vt="http://schemas.openxmlformats.org/officeDocument/2006/docPropsVTypes">
+  <Template>Normal</Template>
+  <TotalTime>35</TotalTime>
+  <Pages>25</Pages>
+  <Words>218</Words>
+  <Characters>1249</Characters>
+  <Application>Microsoft Office Word</Application>
+  <DocSecurity>0</DocSecurity>
+  <Lines>10</Lines>
+  <Paragraphs>2</Paragraphs>
+  <ScaleCrop>false</ScaleCrop>
+  <HeadingPairs>
+    <vt:vector size="2" baseType="variant">
+      <vt:variant>
+        <vt:lpstr>Title</vt:lpstr>
+      </vt:variant>
+      <vt:variant>
+        <vt:i4>1</vt:i4>
+      </vt:variant>
+    </vt:vector>
+  </HeadingPairs>
+  <TitlesOfParts>
+    <vt:vector size="1" baseType="lpstr">
+      <vt:lpstr/>
+    </vt:vector>
+  </TitlesOfParts>
+  <Company/>
+  <LinksUpToDate>false</LinksUpToDate>
+  <CharactersWithSpaces>1465</CharactersWithSpaces>
+  <SharedDoc>false</SharedDoc>
+  <HyperlinksChanged>false</HyperlinksChanged>
+  <AppVersion>16.0000</AppVersion>
+</Properties>
+</file>
+
+<file path=docProps\core.xml><?xml version="1.0" encoding="utf-8"?>
+<cp:coreProperties xmlns:cp="http://schemas.openxmlformats.org/package/2006/metadata/core-properties" xmlns:dc="http://purl.org/dc/elements/1.1/" xmlns:dcterms="http://purl.org/dc/terms/" xmlns:dcmitype="http://purl.org/dc/dcmitype/" xmlns:xsi="http://www.w3.org/2001/XMLSchema-instance">
+  <dc:title/>
+  <dc:subject/>
+  <dc:creator>KIKI SENA</dc:creator>
+  <cp:keywords/>
+  <dc:description/>
+  <cp:lastModifiedBy>KIKI SENA</cp:lastModifiedBy>
+  <cp:revision>3</cp:revision>
+  <dcterms:created xsi:type="dcterms:W3CDTF">2026-09-17T11:22:00Z</dcterms:created>
+  <dcterms:modified xsi:type="dcterms:W3CDTF">2026-09-17T12:00:00Z</dcterms:modified>
+</cp:coreProperties>
+</file>
+
+<file path=word\document.xml><?xml version="1.0" encoding="utf-8"?>
 <w:document xmlns:wpc="http://schemas.microsoft.com/office/word/2010/wordprocessingCanvas" xmlns:cx="http://schemas.microsoft.com/office/drawing/2014/chartex" xmlns:cx1="http://schemas.microsoft.com/office/drawing/2015/9/8/chartex" xmlns:cx2="http://schemas.microsoft.com/office/drawing/2015/10/21/chartex" xmlns:cx3="http://schemas.microsoft.com/office/drawing/2016/5/9/chartex" xmlns:cx4="http://schemas.microsoft.com/office/drawing/2016/5/10/chartex" xmlns:cx5="http://schemas.microsoft.com/office/drawing/2016/5/11/chartex" xmlns:cx6="http://schemas.microsoft.com/office/drawing/2016/5/12/chartex" xmlns:cx7="http://schemas.microsoft.com/office/drawing/2016/5/13/chartex" xmlns:cx8="http://schemas.microsoft.com/office/drawing/2016/5/14/chartex" xmlns:mc="http://schemas.openxmlformats.org/markup-compatibility/2006" xmlns:aink="http://schemas.microsoft.com/office/drawing/2016/ink" xmlns:am3d="http://schemas.microsoft.com/office/drawing/2017/model3d" xmlns:o="urn:schemas-microsoft-com:office:office" xmlns:oel="http://schemas.microsoft.com/office/2019/extlst" xmlns:r="http://schemas.openxmlformats.org/officeDocument/2006/relationships" xmlns:m="http://schemas.openxmlformats.org/officeDocument/2006/math" xmlns:v="urn:schemas-microsoft-com:vml" xmlns:wp14="http://schemas.microsoft.com/office/word/2010/wordprocessingDrawing" xmlns:wp="http://schemas.openxmlformats.org/drawingml/2006/wordprocessingDrawing" xmlns:w10="urn:schemas-microsoft-com:office:word" xmlns:w="http://schemas.openxmlformats.org/wordprocessingml/2006/main" xmlns:w14="http://schemas.microsoft.com/office/word/2010/wordml" xmlns:w15="http://schemas.microsoft.com/office/word/2012/wordml" xmlns:w16cex="http://schemas.microsoft.com/office/word/2018/wordml/cex" xmlns:w16cid="http://schemas.microsoft.com/office/word/2016/wordml/cid" xmlns:w16="http://schemas.microsoft.com/office/word/2018/wordml" xmlns:w16du="http://schemas.microsoft.com/office/word/2023/wordml/word16du" xmlns:w16sdtdh="http://schemas.microsoft.com/office/word/2020/wordml/sdtdatahash" xmlns:w16sdtfl="http://schemas.microsoft.com/office/word/2024/wordml/sdtformatlock" xmlns:w16se="http://schemas.microsoft.com/office/word/2015/wordml/symex" xmlns:wpg="http://schemas.microsoft.com/office/word/2010/wordprocessingGroup" xmlns:wpi="http://schemas.microsoft.com/office/word/2010/wordprocessingInk" xmlns:wne="http://schemas.microsoft.com/office/word/2006/wordml" xmlns:wps="http://schemas.microsoft.com/office/word/2010/wordprocessingShape" mc:Ignorable="w14 w15 w16se w16cid w16 w16cex w16sdtdh w16sdtfl w16du wp14">
   <w:body>
     <w:p>
@@ -298,7 +348,1910 @@
         <w:t>INFORMATIKA JURUSAN TEKNOLOGI INFORMASI POLITEKNIK NEGERI LAMPUNG</w:t>
       </w:r>
     </w:p>
-    <w:p/>
+    <w:p>
+      <w:pPr>
+        <w:spacing w:after="160" w:line="278" w:lineRule="auto"/>
+      </w:pPr>
+      <w:r>
+        <w:br w:type="page"/>
+      </w:r>
+    </w:p>
+    <w:p>
+      <w:pPr>
+        <w:pStyle w:val="Heading2"/>
+      </w:pPr>
+      <w:r>
+        <w:t>Tes 1</w:t>
+      </w:r>
+    </w:p>
+    <w:p>
+      <w:r>
+        <w:t>Program dasar Dart yang menggunakan fungsi main() untuk menampilkan teks "Hello, World!" ke terminal. Tes ini menunjukkan struktur paling sederhana dari sebuah program Dart.</w:t>
+      </w:r>
+    </w:p>
+    <w:p>
+      <w:r>
+        <w:t>File: tes1.dart</w:t>
+      </w:r>
+    </w:p>
+    <w:p>
+      <w:pPr>
+        <w:rPr>
+          <w:lang w:val="en-ID"/>
+        </w:rPr>
+      </w:pPr>
+      <w:r>
+        <w:rPr>
+          <w:noProof/>
+          <w:lang w:val="en-ID"/>
+        </w:rPr>
+        <w:drawing>
+          <wp:inline distT="0" distB="0" distL="0" distR="0" wp14:anchorId="7877FAD2" wp14:editId="7401DF79">
+            <wp:extent cx="5731510" cy="4086225"/>
+            <wp:effectExtent l="0" t="0" r="2540" b="9525"/>
+            <wp:docPr id="962035651" name="Picture 1"/>
+            <wp:cNvGraphicFramePr>
+              <a:graphicFrameLocks xmlns:a="http://schemas.openxmlformats.org/drawingml/2006/main" noChangeAspect="1"/>
+            </wp:cNvGraphicFramePr>
+            <a:graphic xmlns:a="http://schemas.openxmlformats.org/drawingml/2006/main">
+              <a:graphicData uri="http://schemas.openxmlformats.org/drawingml/2006/picture">
+                <pic:pic xmlns:pic="http://schemas.openxmlformats.org/drawingml/2006/picture">
+                  <pic:nvPicPr>
+                    <pic:cNvPr id="962035651" name=""/>
+                    <pic:cNvPicPr/>
+                  </pic:nvPicPr>
+                  <pic:blipFill>
+                    <a:blip r:embed="rId5"/>
+                    <a:stretch>
+                      <a:fillRect/>
+                    </a:stretch>
+                  </pic:blipFill>
+                  <pic:spPr>
+                    <a:xfrm>
+                      <a:off x="0" y="0"/>
+                      <a:ext cx="5731510" cy="4086225"/>
+                    </a:xfrm>
+                    <a:prstGeom prst="rect">
+                      <a:avLst/>
+                    </a:prstGeom>
+                  </pic:spPr>
+                </pic:pic>
+              </a:graphicData>
+            </a:graphic>
+          </wp:inline>
+        </w:drawing>
+      </w:r>
+    </w:p>
+    <w:p>
+      <w:pPr>
+        <w:rPr>
+          <w:lang w:val="en-ID"/>
+        </w:rPr>
+      </w:pPr>
+    </w:p>
+    <w:p>
+      <w:pPr>
+        <w:pStyle w:val="Heading2"/>
+      </w:pPr>
+      <w:r>
+        <w:t>Tes 2</w:t>
+      </w:r>
+    </w:p>
+    <w:p>
+      <w:r>
+        <w:t>Program mendeklarasikan beberapa variabel menggunakan var, seperti nama, tahun, ukuran antena, daftar objek, dan data berbentuk Map. Seluruh data kemudian ditampilkan menggunakan print().</w:t>
+      </w:r>
+    </w:p>
+    <w:p>
+      <w:r>
+        <w:t>File: tes2.dart</w:t>
+      </w:r>
+    </w:p>
+    <w:p>
+      <w:pPr>
+        <w:pStyle w:val="Heading2"/>
+        <w:rPr>
+          <w:b/>
+          <w:bCs/>
+          <w:color w:val="auto"/>
+        </w:rPr>
+      </w:pPr>
+    </w:p>
+    <w:p>
+      <w:pPr>
+        <w:rPr>
+          <w:lang w:val="en-ID"/>
+        </w:rPr>
+      </w:pPr>
+      <w:r>
+        <w:rPr>
+          <w:noProof/>
+          <w:lang w:val="en-ID"/>
+        </w:rPr>
+        <w:drawing>
+          <wp:inline distT="0" distB="0" distL="0" distR="0" wp14:anchorId="1F89303D" wp14:editId="018FBB64">
+            <wp:extent cx="5731510" cy="5106670"/>
+            <wp:effectExtent l="0" t="0" r="2540" b="0"/>
+            <wp:docPr id="789295966" name="Picture 1"/>
+            <wp:cNvGraphicFramePr>
+              <a:graphicFrameLocks xmlns:a="http://schemas.openxmlformats.org/drawingml/2006/main" noChangeAspect="1"/>
+            </wp:cNvGraphicFramePr>
+            <a:graphic xmlns:a="http://schemas.openxmlformats.org/drawingml/2006/main">
+              <a:graphicData uri="http://schemas.openxmlformats.org/drawingml/2006/picture">
+                <pic:pic xmlns:pic="http://schemas.openxmlformats.org/drawingml/2006/picture">
+                  <pic:nvPicPr>
+                    <pic:cNvPr id="789295966" name=""/>
+                    <pic:cNvPicPr/>
+                  </pic:nvPicPr>
+                  <pic:blipFill>
+                    <a:blip r:embed="rId6"/>
+                    <a:stretch>
+                      <a:fillRect/>
+                    </a:stretch>
+                  </pic:blipFill>
+                  <pic:spPr>
+                    <a:xfrm>
+                      <a:off x="0" y="0"/>
+                      <a:ext cx="5731510" cy="5106670"/>
+                    </a:xfrm>
+                    <a:prstGeom prst="rect">
+                      <a:avLst/>
+                    </a:prstGeom>
+                  </pic:spPr>
+                </pic:pic>
+              </a:graphicData>
+            </a:graphic>
+          </wp:inline>
+        </w:drawing>
+      </w:r>
+    </w:p>
+    <w:p>
+      <w:pPr>
+        <w:spacing w:after="160" w:line="278" w:lineRule="auto"/>
+        <w:rPr>
+          <w:lang w:val="en-ID"/>
+        </w:rPr>
+      </w:pPr>
+      <w:r>
+        <w:rPr>
+          <w:lang w:val="en-ID"/>
+        </w:rPr>
+        <w:br w:type="page"/>
+      </w:r>
+    </w:p>
+    <w:p>
+      <w:pPr>
+        <w:pStyle w:val="Heading2"/>
+      </w:pPr>
+      <w:r>
+        <w:t>Tes 3</w:t>
+      </w:r>
+    </w:p>
+    <w:p>
+      <w:r>
+        <w:t>Program menggunakan percabangan if-else if untuk menentukan abad berdasarkan tahun. Program juga menggunakan perulangan for untuk menampilkan objek dan nomor bulan, serta while untuk menaikkan nilai tahun hingga 2016.</w:t>
+      </w:r>
+    </w:p>
+    <w:p>
+      <w:r>
+        <w:t>File: tes3.dart</w:t>
+      </w:r>
+    </w:p>
+    <w:p>
+      <w:pPr>
+        <w:rPr>
+          <w:lang w:val="en-ID"/>
+        </w:rPr>
+      </w:pPr>
+      <w:proofErr w:type="spellStart"/>
+      <w:r>
+        <w:rPr>
+          <w:lang w:val="en-ID"/>
+        </w:rPr>
+        <w:t>Tes</w:t>
+      </w:r>
+      <w:proofErr w:type="spellEnd"/>
+      <w:r>
+        <w:rPr>
+          <w:lang w:val="en-ID"/>
+        </w:rPr>
+        <w:t xml:space="preserve"> 3 — </w:t>
+      </w:r>
+      <w:proofErr w:type="spellStart"/>
+      <w:r>
+        <w:rPr>
+          <w:lang w:val="en-ID"/>
+        </w:rPr>
+        <w:t>Percabangan</w:t>
+      </w:r>
+      <w:proofErr w:type="spellEnd"/>
+      <w:r>
+        <w:rPr>
+          <w:lang w:val="en-ID"/>
+        </w:rPr>
+        <w:t xml:space="preserve"> dan </w:t>
+      </w:r>
+      <w:proofErr w:type="spellStart"/>
+      <w:r>
+        <w:rPr>
+          <w:lang w:val="en-ID"/>
+        </w:rPr>
+        <w:t>Perulangan</w:t>
+      </w:r>
+      <w:proofErr w:type="spellEnd"/>
+    </w:p>
+    <w:p>
+      <w:pPr>
+        <w:rPr>
+          <w:lang w:val="en-ID"/>
+        </w:rPr>
+      </w:pPr>
+      <w:r>
+        <w:rPr>
+          <w:noProof/>
+          <w:lang w:val="en-ID"/>
+        </w:rPr>
+        <w:drawing>
+          <wp:inline distT="0" distB="0" distL="0" distR="0" wp14:anchorId="422D4FAB" wp14:editId="38D1E49D">
+            <wp:extent cx="5731510" cy="6134735"/>
+            <wp:effectExtent l="0" t="0" r="2540" b="0"/>
+            <wp:docPr id="237084209" name="Picture 1"/>
+            <wp:cNvGraphicFramePr>
+              <a:graphicFrameLocks xmlns:a="http://schemas.openxmlformats.org/drawingml/2006/main" noChangeAspect="1"/>
+            </wp:cNvGraphicFramePr>
+            <a:graphic xmlns:a="http://schemas.openxmlformats.org/drawingml/2006/main">
+              <a:graphicData uri="http://schemas.openxmlformats.org/drawingml/2006/picture">
+                <pic:pic xmlns:pic="http://schemas.openxmlformats.org/drawingml/2006/picture">
+                  <pic:nvPicPr>
+                    <pic:cNvPr id="237084209" name=""/>
+                    <pic:cNvPicPr/>
+                  </pic:nvPicPr>
+                  <pic:blipFill>
+                    <a:blip r:embed="rId7"/>
+                    <a:stretch>
+                      <a:fillRect/>
+                    </a:stretch>
+                  </pic:blipFill>
+                  <pic:spPr>
+                    <a:xfrm>
+                      <a:off x="0" y="0"/>
+                      <a:ext cx="5731510" cy="6134735"/>
+                    </a:xfrm>
+                    <a:prstGeom prst="rect">
+                      <a:avLst/>
+                    </a:prstGeom>
+                  </pic:spPr>
+                </pic:pic>
+              </a:graphicData>
+            </a:graphic>
+          </wp:inline>
+        </w:drawing>
+      </w:r>
+    </w:p>
+    <w:p>
+      <w:pPr>
+        <w:spacing w:after="160" w:line="278" w:lineRule="auto"/>
+        <w:rPr>
+          <w:lang w:val="en-ID"/>
+        </w:rPr>
+      </w:pPr>
+      <w:r>
+        <w:rPr>
+          <w:lang w:val="en-ID"/>
+        </w:rPr>
+        <w:br w:type="page"/>
+      </w:r>
+    </w:p>
+    <w:p>
+      <w:pPr>
+        <w:rPr>
+          <w:lang w:val="en-ID"/>
+        </w:rPr>
+      </w:pPr>
+    </w:p>
+    <w:p>
+      <w:pPr>
+        <w:pStyle w:val="Heading2"/>
+      </w:pPr>
+      <w:r>
+        <w:t>Tes 4</w:t>
+      </w:r>
+    </w:p>
+    <w:p>
+      <w:r>
+        <w:t>Program menghitung bilangan Fibonacci menggunakan fungsi rekursif. Fungsi memanggil dirinya sendiri hingga mencapai kondisi dasar, kemudian menghasilkan nilai Fibonacci ke-20.</w:t>
+      </w:r>
+    </w:p>
+    <w:p>
+      <w:r>
+        <w:t>File: tes4.dart</w:t>
+      </w:r>
+    </w:p>
+    <w:p>
+      <w:pPr>
+        <w:rPr>
+          <w:lang w:val="en-ID"/>
+        </w:rPr>
+      </w:pPr>
+      <w:proofErr w:type="spellStart"/>
+      <w:r>
+        <w:rPr>
+          <w:lang w:val="en-ID"/>
+        </w:rPr>
+        <w:t>Tes</w:t>
+      </w:r>
+      <w:proofErr w:type="spellEnd"/>
+      <w:r>
+        <w:rPr>
+          <w:lang w:val="en-ID"/>
+        </w:rPr>
+        <w:t xml:space="preserve"> 4 — </w:t>
+      </w:r>
+      <w:proofErr w:type="spellStart"/>
+      <w:r>
+        <w:rPr>
+          <w:lang w:val="en-ID"/>
+        </w:rPr>
+        <w:t>Fungsi</w:t>
+      </w:r>
+      <w:proofErr w:type="spellEnd"/>
+      <w:r>
+        <w:rPr>
+          <w:lang w:val="en-ID"/>
+        </w:rPr>
+        <w:t xml:space="preserve"> </w:t>
+      </w:r>
+      <w:proofErr w:type="spellStart"/>
+      <w:r>
+        <w:rPr>
+          <w:lang w:val="en-ID"/>
+        </w:rPr>
+        <w:t>Rekursif</w:t>
+      </w:r>
+      <w:proofErr w:type="spellEnd"/>
+      <w:r>
+        <w:rPr>
+          <w:lang w:val="en-ID"/>
+        </w:rPr>
+        <w:t xml:space="preserve"> Fibonacci</w:t>
+      </w:r>
+    </w:p>
+    <w:p>
+      <w:pPr>
+        <w:rPr>
+          <w:lang w:val="en-ID"/>
+        </w:rPr>
+      </w:pPr>
+      <w:r>
+        <w:rPr>
+          <w:noProof/>
+          <w:lang w:val="en-ID"/>
+        </w:rPr>
+        <w:drawing>
+          <wp:inline distT="0" distB="0" distL="0" distR="0" wp14:anchorId="610793E8" wp14:editId="14056BA5">
+            <wp:extent cx="5731510" cy="5171440"/>
+            <wp:effectExtent l="0" t="0" r="2540" b="0"/>
+            <wp:docPr id="1786441705" name="Picture 1"/>
+            <wp:cNvGraphicFramePr>
+              <a:graphicFrameLocks xmlns:a="http://schemas.openxmlformats.org/drawingml/2006/main" noChangeAspect="1"/>
+            </wp:cNvGraphicFramePr>
+            <a:graphic xmlns:a="http://schemas.openxmlformats.org/drawingml/2006/main">
+              <a:graphicData uri="http://schemas.openxmlformats.org/drawingml/2006/picture">
+                <pic:pic xmlns:pic="http://schemas.openxmlformats.org/drawingml/2006/picture">
+                  <pic:nvPicPr>
+                    <pic:cNvPr id="1786441705" name=""/>
+                    <pic:cNvPicPr/>
+                  </pic:nvPicPr>
+                  <pic:blipFill>
+                    <a:blip r:embed="rId8"/>
+                    <a:stretch>
+                      <a:fillRect/>
+                    </a:stretch>
+                  </pic:blipFill>
+                  <pic:spPr>
+                    <a:xfrm>
+                      <a:off x="0" y="0"/>
+                      <a:ext cx="5731510" cy="5171440"/>
+                    </a:xfrm>
+                    <a:prstGeom prst="rect">
+                      <a:avLst/>
+                    </a:prstGeom>
+                  </pic:spPr>
+                </pic:pic>
+              </a:graphicData>
+            </a:graphic>
+          </wp:inline>
+        </w:drawing>
+      </w:r>
+    </w:p>
+    <w:p>
+      <w:pPr>
+        <w:spacing w:after="160" w:line="278" w:lineRule="auto"/>
+        <w:rPr>
+          <w:lang w:val="en-ID"/>
+        </w:rPr>
+      </w:pPr>
+      <w:r>
+        <w:rPr>
+          <w:lang w:val="en-ID"/>
+        </w:rPr>
+        <w:br w:type="page"/>
+      </w:r>
+    </w:p>
+    <w:p>
+      <w:pPr>
+        <w:rPr>
+          <w:lang w:val="en-ID"/>
+        </w:rPr>
+      </w:pPr>
+    </w:p>
+    <w:p>
+      <w:pPr>
+        <w:pStyle w:val="Heading2"/>
+      </w:pPr>
+      <w:r>
+        <w:t>Tes 5</w:t>
+      </w:r>
+    </w:p>
+    <w:p>
+      <w:r>
+        <w:t>Program menyaring daftar objek menggunakan where() dan fungsi anonim berbentuk arrow function. Hanya objek yang mengandung teks "turn", yaitu Saturn, yang ditampilkan menggunakan forEach().</w:t>
+      </w:r>
+    </w:p>
+    <w:p>
+      <w:r>
+        <w:t>File: tes5.dart</w:t>
+      </w:r>
+    </w:p>
+    <w:p>
+      <w:pPr>
+        <w:rPr>
+          <w:lang w:val="en-ID"/>
+        </w:rPr>
+      </w:pPr>
+      <w:r>
+        <w:rPr>
+          <w:noProof/>
+          <w:lang w:val="en-ID"/>
+        </w:rPr>
+        <w:drawing>
+          <wp:inline distT="0" distB="0" distL="0" distR="0" wp14:anchorId="468C459D" wp14:editId="767B3BA8">
+            <wp:extent cx="5731510" cy="4279265"/>
+            <wp:effectExtent l="0" t="0" r="2540" b="6985"/>
+            <wp:docPr id="1389809465" name="Picture 1"/>
+            <wp:cNvGraphicFramePr>
+              <a:graphicFrameLocks xmlns:a="http://schemas.openxmlformats.org/drawingml/2006/main" noChangeAspect="1"/>
+            </wp:cNvGraphicFramePr>
+            <a:graphic xmlns:a="http://schemas.openxmlformats.org/drawingml/2006/main">
+              <a:graphicData uri="http://schemas.openxmlformats.org/drawingml/2006/picture">
+                <pic:pic xmlns:pic="http://schemas.openxmlformats.org/drawingml/2006/picture">
+                  <pic:nvPicPr>
+                    <pic:cNvPr id="1389809465" name=""/>
+                    <pic:cNvPicPr/>
+                  </pic:nvPicPr>
+                  <pic:blipFill>
+                    <a:blip r:embed="rId9"/>
+                    <a:stretch>
+                      <a:fillRect/>
+                    </a:stretch>
+                  </pic:blipFill>
+                  <pic:spPr>
+                    <a:xfrm>
+                      <a:off x="0" y="0"/>
+                      <a:ext cx="5731510" cy="4279265"/>
+                    </a:xfrm>
+                    <a:prstGeom prst="rect">
+                      <a:avLst/>
+                    </a:prstGeom>
+                  </pic:spPr>
+                </pic:pic>
+              </a:graphicData>
+            </a:graphic>
+          </wp:inline>
+        </w:drawing>
+      </w:r>
+    </w:p>
+    <w:p>
+      <w:pPr>
+        <w:rPr>
+          <w:lang w:val="en-ID"/>
+        </w:rPr>
+      </w:pPr>
+    </w:p>
+    <w:p>
+      <w:pPr>
+        <w:pStyle w:val="Heading2"/>
+      </w:pPr>
+      <w:r>
+        <w:t>Tes 6</w:t>
+      </w:r>
+    </w:p>
+    <w:p>
+      <w:r>
+        <w:t>Program menunjukkan penggunaan komentar satu baris, komentar dokumentasi, dan komentar banyak baris. Komentar tidak dijalankan oleh program, tetapi digunakan untuk memberikan penjelasan pada kode.</w:t>
+      </w:r>
+    </w:p>
+    <w:p>
+      <w:r>
+        <w:t>File: tes6.dart</w:t>
+      </w:r>
+    </w:p>
+    <w:p>
+      <w:pPr>
+        <w:rPr>
+          <w:lang w:val="en-ID"/>
+        </w:rPr>
+      </w:pPr>
+      <w:r>
+        <w:rPr>
+          <w:noProof/>
+          <w:lang w:val="en-ID"/>
+        </w:rPr>
+        <w:drawing>
+          <wp:inline distT="0" distB="0" distL="0" distR="0" wp14:anchorId="46E86AC1" wp14:editId="535DD333">
+            <wp:extent cx="5731510" cy="4443730"/>
+            <wp:effectExtent l="0" t="0" r="2540" b="0"/>
+            <wp:docPr id="80787058" name="Picture 1"/>
+            <wp:cNvGraphicFramePr>
+              <a:graphicFrameLocks xmlns:a="http://schemas.openxmlformats.org/drawingml/2006/main" noChangeAspect="1"/>
+            </wp:cNvGraphicFramePr>
+            <a:graphic xmlns:a="http://schemas.openxmlformats.org/drawingml/2006/main">
+              <a:graphicData uri="http://schemas.openxmlformats.org/drawingml/2006/picture">
+                <pic:pic xmlns:pic="http://schemas.openxmlformats.org/drawingml/2006/picture">
+                  <pic:nvPicPr>
+                    <pic:cNvPr id="80787058" name=""/>
+                    <pic:cNvPicPr/>
+                  </pic:nvPicPr>
+                  <pic:blipFill>
+                    <a:blip r:embed="rId10"/>
+                    <a:stretch>
+                      <a:fillRect/>
+                    </a:stretch>
+                  </pic:blipFill>
+                  <pic:spPr>
+                    <a:xfrm>
+                      <a:off x="0" y="0"/>
+                      <a:ext cx="5731510" cy="4443730"/>
+                    </a:xfrm>
+                    <a:prstGeom prst="rect">
+                      <a:avLst/>
+                    </a:prstGeom>
+                  </pic:spPr>
+                </pic:pic>
+              </a:graphicData>
+            </a:graphic>
+          </wp:inline>
+        </w:drawing>
+      </w:r>
+    </w:p>
+    <w:p>
+      <w:pPr>
+        <w:rPr>
+          <w:lang w:val="en-ID"/>
+        </w:rPr>
+      </w:pPr>
+    </w:p>
+    <w:p>
+      <w:pPr>
+        <w:pStyle w:val="Heading2"/>
+      </w:pPr>
+      <w:r>
+        <w:t>Tes 7</w:t>
+      </w:r>
+    </w:p>
+    <w:p>
+      <w:r>
+        <w:t>Program menggunakan import dart:math untuk mengakses konstanta pi. Contoh ini menghitung luas lingkaran berdasarkan nilai radius dan menunjukkan cara menggunakan library bawaan Dart.</w:t>
+      </w:r>
+    </w:p>
+    <w:p>
+      <w:r>
+        <w:t>File: tes7.dart</w:t>
+      </w:r>
+    </w:p>
+    <w:p>
+      <w:pPr>
+        <w:rPr>
+          <w:lang w:val="en-ID"/>
+        </w:rPr>
+      </w:pPr>
+      <w:r>
+        <w:rPr>
+          <w:noProof/>
+          <w:lang w:val="en-ID"/>
+        </w:rPr>
+        <w:drawing>
+          <wp:inline distT="0" distB="0" distL="0" distR="0" wp14:anchorId="62F5C514" wp14:editId="133C93A6">
+            <wp:extent cx="5731510" cy="4761865"/>
+            <wp:effectExtent l="0" t="0" r="2540" b="635"/>
+            <wp:docPr id="479916289" name="Picture 1"/>
+            <wp:cNvGraphicFramePr>
+              <a:graphicFrameLocks xmlns:a="http://schemas.openxmlformats.org/drawingml/2006/main" noChangeAspect="1"/>
+            </wp:cNvGraphicFramePr>
+            <a:graphic xmlns:a="http://schemas.openxmlformats.org/drawingml/2006/main">
+              <a:graphicData uri="http://schemas.openxmlformats.org/drawingml/2006/picture">
+                <pic:pic xmlns:pic="http://schemas.openxmlformats.org/drawingml/2006/picture">
+                  <pic:nvPicPr>
+                    <pic:cNvPr id="479916289" name=""/>
+                    <pic:cNvPicPr/>
+                  </pic:nvPicPr>
+                  <pic:blipFill>
+                    <a:blip r:embed="rId11"/>
+                    <a:stretch>
+                      <a:fillRect/>
+                    </a:stretch>
+                  </pic:blipFill>
+                  <pic:spPr>
+                    <a:xfrm>
+                      <a:off x="0" y="0"/>
+                      <a:ext cx="5731510" cy="4761865"/>
+                    </a:xfrm>
+                    <a:prstGeom prst="rect">
+                      <a:avLst/>
+                    </a:prstGeom>
+                  </pic:spPr>
+                </pic:pic>
+              </a:graphicData>
+            </a:graphic>
+          </wp:inline>
+        </w:drawing>
+      </w:r>
+    </w:p>
+    <w:p>
+      <w:pPr>
+        <w:rPr>
+          <w:lang w:val="en-ID"/>
+        </w:rPr>
+      </w:pPr>
+    </w:p>
+    <w:p>
+      <w:pPr>
+        <w:pStyle w:val="Heading2"/>
+      </w:pPr>
+      <w:r>
+        <w:t>Tes 8</w:t>
+      </w:r>
+    </w:p>
+    <w:p>
+      <w:r>
+        <w:t>Program membuat class Spacecraft dengan properti nama dan tanggal peluncuran. Class ini memiliki constructor, named constructor unlaunched, getter launchYear, serta method describe() untuk menampilkan informasi spacecraft.</w:t>
+      </w:r>
+    </w:p>
+    <w:p>
+      <w:r>
+        <w:t>File: tes8.dart</w:t>
+      </w:r>
+    </w:p>
+    <w:p>
+      <w:pPr>
+        <w:rPr>
+          <w:lang w:val="en-ID"/>
+        </w:rPr>
+      </w:pPr>
+      <w:r>
+        <w:rPr>
+          <w:noProof/>
+          <w:lang w:val="en-ID"/>
+        </w:rPr>
+        <w:drawing>
+          <wp:inline distT="0" distB="0" distL="0" distR="0" wp14:anchorId="614379C1" wp14:editId="63C4B31B">
+            <wp:extent cx="5731510" cy="6528435"/>
+            <wp:effectExtent l="0" t="0" r="2540" b="5715"/>
+            <wp:docPr id="1671151444" name="Picture 1"/>
+            <wp:cNvGraphicFramePr>
+              <a:graphicFrameLocks xmlns:a="http://schemas.openxmlformats.org/drawingml/2006/main" noChangeAspect="1"/>
+            </wp:cNvGraphicFramePr>
+            <a:graphic xmlns:a="http://schemas.openxmlformats.org/drawingml/2006/main">
+              <a:graphicData uri="http://schemas.openxmlformats.org/drawingml/2006/picture">
+                <pic:pic xmlns:pic="http://schemas.openxmlformats.org/drawingml/2006/picture">
+                  <pic:nvPicPr>
+                    <pic:cNvPr id="1671151444" name=""/>
+                    <pic:cNvPicPr/>
+                  </pic:nvPicPr>
+                  <pic:blipFill>
+                    <a:blip r:embed="rId12"/>
+                    <a:stretch>
+                      <a:fillRect/>
+                    </a:stretch>
+                  </pic:blipFill>
+                  <pic:spPr>
+                    <a:xfrm>
+                      <a:off x="0" y="0"/>
+                      <a:ext cx="5731510" cy="6528435"/>
+                    </a:xfrm>
+                    <a:prstGeom prst="rect">
+                      <a:avLst/>
+                    </a:prstGeom>
+                  </pic:spPr>
+                </pic:pic>
+              </a:graphicData>
+            </a:graphic>
+          </wp:inline>
+        </w:drawing>
+      </w:r>
+    </w:p>
+    <w:p>
+      <w:pPr>
+        <w:rPr>
+          <w:lang w:val="en-ID"/>
+        </w:rPr>
+      </w:pPr>
+    </w:p>
+    <w:p>
+      <w:pPr>
+        <w:pStyle w:val="Heading2"/>
+      </w:pPr>
+      <w:r>
+        <w:t>Tes 9</w:t>
+      </w:r>
+    </w:p>
+    <w:p>
+      <w:r>
+        <w:t>Program membuat objek dari class Spacecraft menggunakan constructor biasa dan named constructor. Setiap objek kemudian memanggil method describe() untuk menampilkan informasi spacecraft.</w:t>
+      </w:r>
+    </w:p>
+    <w:p>
+      <w:r>
+        <w:t>File: tes9.dart</w:t>
+      </w:r>
+    </w:p>
+    <w:p>
+      <w:pPr>
+        <w:rPr>
+          <w:lang w:val="en-ID"/>
+        </w:rPr>
+      </w:pPr>
+      <w:r>
+        <w:rPr>
+          <w:noProof/>
+          <w:lang w:val="en-ID"/>
+        </w:rPr>
+        <w:drawing>
+          <wp:inline distT="0" distB="0" distL="0" distR="0" wp14:anchorId="320683C4" wp14:editId="6BD67881">
+            <wp:extent cx="5731510" cy="6767195"/>
+            <wp:effectExtent l="0" t="0" r="2540" b="0"/>
+            <wp:docPr id="14987529" name="Picture 1"/>
+            <wp:cNvGraphicFramePr>
+              <a:graphicFrameLocks xmlns:a="http://schemas.openxmlformats.org/drawingml/2006/main" noChangeAspect="1"/>
+            </wp:cNvGraphicFramePr>
+            <a:graphic xmlns:a="http://schemas.openxmlformats.org/drawingml/2006/main">
+              <a:graphicData uri="http://schemas.openxmlformats.org/drawingml/2006/picture">
+                <pic:pic xmlns:pic="http://schemas.openxmlformats.org/drawingml/2006/picture">
+                  <pic:nvPicPr>
+                    <pic:cNvPr id="14987529" name=""/>
+                    <pic:cNvPicPr/>
+                  </pic:nvPicPr>
+                  <pic:blipFill>
+                    <a:blip r:embed="rId13"/>
+                    <a:stretch>
+                      <a:fillRect/>
+                    </a:stretch>
+                  </pic:blipFill>
+                  <pic:spPr>
+                    <a:xfrm>
+                      <a:off x="0" y="0"/>
+                      <a:ext cx="5731510" cy="6767195"/>
+                    </a:xfrm>
+                    <a:prstGeom prst="rect">
+                      <a:avLst/>
+                    </a:prstGeom>
+                  </pic:spPr>
+                </pic:pic>
+              </a:graphicData>
+            </a:graphic>
+          </wp:inline>
+        </w:drawing>
+      </w:r>
+    </w:p>
+    <w:p>
+      <w:pPr>
+        <w:spacing w:after="160" w:line="278" w:lineRule="auto"/>
+        <w:rPr>
+          <w:lang w:val="en-ID"/>
+        </w:rPr>
+      </w:pPr>
+      <w:r>
+        <w:rPr>
+          <w:lang w:val="en-ID"/>
+        </w:rPr>
+        <w:br w:type="page"/>
+      </w:r>
+    </w:p>
+    <w:p>
+      <w:pPr>
+        <w:pStyle w:val="Heading2"/>
+      </w:pPr>
+      <w:r>
+        <w:t>Tes 10</w:t>
+      </w:r>
+    </w:p>
+    <w:p>
+      <w:r>
+        <w:t>Program mendefinisikan enum PlanetType dengan tiga pilihan tipe planet, yaitu terrestrial, gas, dan ice. Program kemudian menampilkan seluruh nilai enum dan salah satu nilai tertentu.</w:t>
+      </w:r>
+    </w:p>
+    <w:p>
+      <w:r>
+        <w:t>File: tes10.dart</w:t>
+      </w:r>
+    </w:p>
+    <w:p>
+      <w:pPr>
+        <w:rPr>
+          <w:lang w:val="en-ID"/>
+        </w:rPr>
+      </w:pPr>
+      <w:r>
+        <w:rPr>
+          <w:noProof/>
+          <w:lang w:val="en-ID"/>
+        </w:rPr>
+        <w:drawing>
+          <wp:inline distT="0" distB="0" distL="0" distR="0" wp14:anchorId="6F60A77A" wp14:editId="78073AF8">
+            <wp:extent cx="5731510" cy="2865755"/>
+            <wp:effectExtent l="0" t="0" r="2540" b="0"/>
+            <wp:docPr id="1249467266" name="Picture 1"/>
+            <wp:cNvGraphicFramePr>
+              <a:graphicFrameLocks xmlns:a="http://schemas.openxmlformats.org/drawingml/2006/main" noChangeAspect="1"/>
+            </wp:cNvGraphicFramePr>
+            <a:graphic xmlns:a="http://schemas.openxmlformats.org/drawingml/2006/main">
+              <a:graphicData uri="http://schemas.openxmlformats.org/drawingml/2006/picture">
+                <pic:pic xmlns:pic="http://schemas.openxmlformats.org/drawingml/2006/picture">
+                  <pic:nvPicPr>
+                    <pic:cNvPr id="1249467266" name=""/>
+                    <pic:cNvPicPr/>
+                  </pic:nvPicPr>
+                  <pic:blipFill>
+                    <a:blip r:embed="rId14"/>
+                    <a:stretch>
+                      <a:fillRect/>
+                    </a:stretch>
+                  </pic:blipFill>
+                  <pic:spPr>
+                    <a:xfrm>
+                      <a:off x="0" y="0"/>
+                      <a:ext cx="5731510" cy="2865755"/>
+                    </a:xfrm>
+                    <a:prstGeom prst="rect">
+                      <a:avLst/>
+                    </a:prstGeom>
+                  </pic:spPr>
+                </pic:pic>
+              </a:graphicData>
+            </a:graphic>
+          </wp:inline>
+        </w:drawing>
+      </w:r>
+    </w:p>
+    <w:p>
+      <w:pPr>
+        <w:rPr>
+          <w:lang w:val="en-ID"/>
+        </w:rPr>
+      </w:pPr>
+    </w:p>
+    <w:p>
+      <w:pPr>
+        <w:pStyle w:val="Heading2"/>
+      </w:pPr>
+      <w:r>
+        <w:t>Tes 11</w:t>
+      </w:r>
+    </w:p>
+    <w:p>
+      <w:r>
+        <w:t>Program menggunakan enhanced enum Planet yang memiliki constructor konstan, properti jumlah bulan, tipe planet, dan informasi cincin. Enum juga memiliki getter isGiant untuk menentukan apakah planet termasuk planet raksasa.</w:t>
+      </w:r>
+    </w:p>
+    <w:p>
+      <w:r>
+        <w:t>File: tes11.dart</w:t>
+      </w:r>
+    </w:p>
+    <w:p>
+      <w:pPr>
+        <w:rPr>
+          <w:lang w:val="en-ID"/>
+        </w:rPr>
+      </w:pPr>
+      <w:r>
+        <w:rPr>
+          <w:noProof/>
+          <w:lang w:val="en-ID"/>
+        </w:rPr>
+        <w:drawing>
+          <wp:inline distT="0" distB="0" distL="0" distR="0" wp14:anchorId="51F07FCC" wp14:editId="7D034578">
+            <wp:extent cx="5731510" cy="5363210"/>
+            <wp:effectExtent l="0" t="0" r="2540" b="8890"/>
+            <wp:docPr id="895454566" name="Picture 1"/>
+            <wp:cNvGraphicFramePr>
+              <a:graphicFrameLocks xmlns:a="http://schemas.openxmlformats.org/drawingml/2006/main" noChangeAspect="1"/>
+            </wp:cNvGraphicFramePr>
+            <a:graphic xmlns:a="http://schemas.openxmlformats.org/drawingml/2006/main">
+              <a:graphicData uri="http://schemas.openxmlformats.org/drawingml/2006/picture">
+                <pic:pic xmlns:pic="http://schemas.openxmlformats.org/drawingml/2006/picture">
+                  <pic:nvPicPr>
+                    <pic:cNvPr id="895454566" name=""/>
+                    <pic:cNvPicPr/>
+                  </pic:nvPicPr>
+                  <pic:blipFill>
+                    <a:blip r:embed="rId15"/>
+                    <a:stretch>
+                      <a:fillRect/>
+                    </a:stretch>
+                  </pic:blipFill>
+                  <pic:spPr>
+                    <a:xfrm>
+                      <a:off x="0" y="0"/>
+                      <a:ext cx="5731510" cy="5363210"/>
+                    </a:xfrm>
+                    <a:prstGeom prst="rect">
+                      <a:avLst/>
+                    </a:prstGeom>
+                  </pic:spPr>
+                </pic:pic>
+              </a:graphicData>
+            </a:graphic>
+          </wp:inline>
+        </w:drawing>
+      </w:r>
+    </w:p>
+    <w:p>
+      <w:pPr>
+        <w:rPr>
+          <w:lang w:val="en-ID"/>
+        </w:rPr>
+      </w:pPr>
+    </w:p>
+    <w:p>
+      <w:pPr>
+        <w:pStyle w:val="Heading2"/>
+      </w:pPr>
+      <w:r>
+        <w:t>Tes 12</w:t>
+      </w:r>
+    </w:p>
+    <w:p>
+      <w:r>
+        <w:t>Program mengambil nilai planet tertentu dan memeriksa properti isGiant. Percabangan digunakan untuk menampilkan apakah planet tersebut merupakan planet raksasa atau bukan.</w:t>
+      </w:r>
+    </w:p>
+    <w:p>
+      <w:r>
+        <w:t>File: tes12.dart</w:t>
+      </w:r>
+    </w:p>
+    <w:p>
+      <w:pPr>
+        <w:rPr>
+          <w:b/>
+          <w:bCs/>
+          <w:lang w:val="en-ID"/>
+        </w:rPr>
+      </w:pPr>
+      <w:r>
+        <w:rPr>
+          <w:b/>
+          <w:bCs/>
+          <w:noProof/>
+          <w:lang w:val="en-ID"/>
+        </w:rPr>
+        <w:lastRenderedPageBreak/>
+        <w:drawing>
+          <wp:inline distT="0" distB="0" distL="0" distR="0" wp14:anchorId="71D6631E" wp14:editId="22B712B2">
+            <wp:extent cx="5731510" cy="5388610"/>
+            <wp:effectExtent l="0" t="0" r="2540" b="2540"/>
+            <wp:docPr id="564401268" name="Picture 1"/>
+            <wp:cNvGraphicFramePr>
+              <a:graphicFrameLocks xmlns:a="http://schemas.openxmlformats.org/drawingml/2006/main" noChangeAspect="1"/>
+            </wp:cNvGraphicFramePr>
+            <a:graphic xmlns:a="http://schemas.openxmlformats.org/drawingml/2006/main">
+              <a:graphicData uri="http://schemas.openxmlformats.org/drawingml/2006/picture">
+                <pic:pic xmlns:pic="http://schemas.openxmlformats.org/drawingml/2006/picture">
+                  <pic:nvPicPr>
+                    <pic:cNvPr id="564401268" name=""/>
+                    <pic:cNvPicPr/>
+                  </pic:nvPicPr>
+                  <pic:blipFill>
+                    <a:blip r:embed="rId16"/>
+                    <a:stretch>
+                      <a:fillRect/>
+                    </a:stretch>
+                  </pic:blipFill>
+                  <pic:spPr>
+                    <a:xfrm>
+                      <a:off x="0" y="0"/>
+                      <a:ext cx="5731510" cy="5388610"/>
+                    </a:xfrm>
+                    <a:prstGeom prst="rect">
+                      <a:avLst/>
+                    </a:prstGeom>
+                  </pic:spPr>
+                </pic:pic>
+              </a:graphicData>
+            </a:graphic>
+          </wp:inline>
+        </w:drawing>
+      </w:r>
+    </w:p>
+    <w:p>
+      <w:pPr>
+        <w:rPr>
+          <w:b/>
+          <w:bCs/>
+          <w:lang w:val="en-ID"/>
+        </w:rPr>
+      </w:pPr>
+    </w:p>
+    <w:p>
+      <w:pPr>
+        <w:pStyle w:val="Heading2"/>
+      </w:pPr>
+      <w:r>
+        <w:t>Tes 13</w:t>
+      </w:r>
+    </w:p>
+    <w:p>
+      <w:r>
+        <w:t>Program menunjukkan penggunaan penulisan enum secara lengkap dan dot shorthand. Kedua cara tersebut menghasilkan nilai enum yang sama, tetapi dot shorthand membuat kode lebih ringkas ketika tipe data sudah diketahui Dart.</w:t>
+      </w:r>
+    </w:p>
+    <w:p>
+      <w:r>
+        <w:t>File: tes13.dart</w:t>
+      </w:r>
+    </w:p>
+    <w:p>
+      <w:pPr>
+        <w:rPr>
+          <w:lang w:val="en-ID"/>
+        </w:rPr>
+      </w:pPr>
+      <w:r>
+        <w:rPr>
+          <w:noProof/>
+          <w:lang w:val="en-ID"/>
+        </w:rPr>
+        <w:drawing>
+          <wp:inline distT="0" distB="0" distL="0" distR="0" wp14:anchorId="425A4729" wp14:editId="04F9271E">
+            <wp:extent cx="5731510" cy="6026785"/>
+            <wp:effectExtent l="0" t="0" r="2540" b="0"/>
+            <wp:docPr id="348503817" name="Picture 1"/>
+            <wp:cNvGraphicFramePr>
+              <a:graphicFrameLocks xmlns:a="http://schemas.openxmlformats.org/drawingml/2006/main" noChangeAspect="1"/>
+            </wp:cNvGraphicFramePr>
+            <a:graphic xmlns:a="http://schemas.openxmlformats.org/drawingml/2006/main">
+              <a:graphicData uri="http://schemas.openxmlformats.org/drawingml/2006/picture">
+                <pic:pic xmlns:pic="http://schemas.openxmlformats.org/drawingml/2006/picture">
+                  <pic:nvPicPr>
+                    <pic:cNvPr id="348503817" name=""/>
+                    <pic:cNvPicPr/>
+                  </pic:nvPicPr>
+                  <pic:blipFill>
+                    <a:blip r:embed="rId17"/>
+                    <a:stretch>
+                      <a:fillRect/>
+                    </a:stretch>
+                  </pic:blipFill>
+                  <pic:spPr>
+                    <a:xfrm>
+                      <a:off x="0" y="0"/>
+                      <a:ext cx="5731510" cy="6026785"/>
+                    </a:xfrm>
+                    <a:prstGeom prst="rect">
+                      <a:avLst/>
+                    </a:prstGeom>
+                  </pic:spPr>
+                </pic:pic>
+              </a:graphicData>
+            </a:graphic>
+          </wp:inline>
+        </w:drawing>
+      </w:r>
+    </w:p>
+    <w:p>
+      <w:pPr>
+        <w:rPr>
+          <w:lang w:val="en-ID"/>
+        </w:rPr>
+      </w:pPr>
+    </w:p>
+    <w:p>
+      <w:pPr>
+        <w:pStyle w:val="Heading2"/>
+      </w:pPr>
+      <w:r>
+        <w:t>Tes 14</w:t>
+      </w:r>
+    </w:p>
+    <w:p>
+      <w:r>
+        <w:t>Program membuat class Orbiter yang mewarisi class Spacecraft. Constructor Orbiter menggunakan super parameter untuk meneruskan nilai nama dan tanggal peluncuran ke class induk.</w:t>
+      </w:r>
+    </w:p>
+    <w:p>
+      <w:r>
+        <w:t>File: tes14.dart</w:t>
+      </w:r>
+    </w:p>
+    <w:p>
+      <w:pPr>
+        <w:rPr>
+          <w:lang w:val="en-ID"/>
+        </w:rPr>
+      </w:pPr>
+      <w:r>
+        <w:rPr>
+          <w:noProof/>
+          <w:lang w:val="en-ID"/>
+        </w:rPr>
+        <w:drawing>
+          <wp:inline distT="0" distB="0" distL="0" distR="0" wp14:anchorId="4D550BED" wp14:editId="697795E8">
+            <wp:extent cx="5731510" cy="6392545"/>
+            <wp:effectExtent l="0" t="0" r="2540" b="8255"/>
+            <wp:docPr id="341900461" name="Picture 1"/>
+            <wp:cNvGraphicFramePr>
+              <a:graphicFrameLocks xmlns:a="http://schemas.openxmlformats.org/drawingml/2006/main" noChangeAspect="1"/>
+            </wp:cNvGraphicFramePr>
+            <a:graphic xmlns:a="http://schemas.openxmlformats.org/drawingml/2006/main">
+              <a:graphicData uri="http://schemas.openxmlformats.org/drawingml/2006/picture">
+                <pic:pic xmlns:pic="http://schemas.openxmlformats.org/drawingml/2006/picture">
+                  <pic:nvPicPr>
+                    <pic:cNvPr id="341900461" name=""/>
+                    <pic:cNvPicPr/>
+                  </pic:nvPicPr>
+                  <pic:blipFill>
+                    <a:blip r:embed="rId18"/>
+                    <a:stretch>
+                      <a:fillRect/>
+                    </a:stretch>
+                  </pic:blipFill>
+                  <pic:spPr>
+                    <a:xfrm>
+                      <a:off x="0" y="0"/>
+                      <a:ext cx="5731510" cy="6392545"/>
+                    </a:xfrm>
+                    <a:prstGeom prst="rect">
+                      <a:avLst/>
+                    </a:prstGeom>
+                  </pic:spPr>
+                </pic:pic>
+              </a:graphicData>
+            </a:graphic>
+          </wp:inline>
+        </w:drawing>
+      </w:r>
+    </w:p>
+    <w:p>
+      <w:pPr>
+        <w:rPr>
+          <w:lang w:val="en-ID"/>
+        </w:rPr>
+      </w:pPr>
+    </w:p>
+    <w:p>
+      <w:pPr>
+        <w:pStyle w:val="Heading2"/>
+      </w:pPr>
+      <w:r>
+        <w:t>Tes 15</w:t>
+      </w:r>
+    </w:p>
+    <w:p>
+      <w:r>
+        <w:t>Program mendefinisikan mixin Piloted yang memiliki properti jumlah astronaut dan method describeCrew(). Mixin digunakan untuk menambahkan kemampuan ke sebuah class tanpa inheritance langsung.</w:t>
+      </w:r>
+    </w:p>
+    <w:p>
+      <w:r>
+        <w:t>File: tes15.dart</w:t>
+      </w:r>
+    </w:p>
+    <w:p>
+      <w:pPr>
+        <w:rPr>
+          <w:lang w:val="en-ID"/>
+        </w:rPr>
+      </w:pPr>
+      <w:r>
+        <w:rPr>
+          <w:noProof/>
+          <w:lang w:val="en-ID"/>
+        </w:rPr>
+        <w:drawing>
+          <wp:inline distT="0" distB="0" distL="0" distR="0" wp14:anchorId="01AB30AA" wp14:editId="121DCDDD">
+            <wp:extent cx="5731510" cy="4509135"/>
+            <wp:effectExtent l="0" t="0" r="2540" b="5715"/>
+            <wp:docPr id="241631416" name="Picture 1"/>
+            <wp:cNvGraphicFramePr>
+              <a:graphicFrameLocks xmlns:a="http://schemas.openxmlformats.org/drawingml/2006/main" noChangeAspect="1"/>
+            </wp:cNvGraphicFramePr>
+            <a:graphic xmlns:a="http://schemas.openxmlformats.org/drawingml/2006/main">
+              <a:graphicData uri="http://schemas.openxmlformats.org/drawingml/2006/picture">
+                <pic:pic xmlns:pic="http://schemas.openxmlformats.org/drawingml/2006/picture">
+                  <pic:nvPicPr>
+                    <pic:cNvPr id="241631416" name=""/>
+                    <pic:cNvPicPr/>
+                  </pic:nvPicPr>
+                  <pic:blipFill>
+                    <a:blip r:embed="rId19"/>
+                    <a:stretch>
+                      <a:fillRect/>
+                    </a:stretch>
+                  </pic:blipFill>
+                  <pic:spPr>
+                    <a:xfrm>
+                      <a:off x="0" y="0"/>
+                      <a:ext cx="5731510" cy="4509135"/>
+                    </a:xfrm>
+                    <a:prstGeom prst="rect">
+                      <a:avLst/>
+                    </a:prstGeom>
+                  </pic:spPr>
+                </pic:pic>
+              </a:graphicData>
+            </a:graphic>
+          </wp:inline>
+        </w:drawing>
+      </w:r>
+    </w:p>
+    <w:p>
+      <w:pPr>
+        <w:rPr>
+          <w:lang w:val="en-ID"/>
+        </w:rPr>
+      </w:pPr>
+    </w:p>
+    <w:p>
+      <w:pPr>
+        <w:pStyle w:val="Heading2"/>
+      </w:pPr>
+      <w:r>
+        <w:t>Tes 16</w:t>
+      </w:r>
+    </w:p>
+    <w:p>
+      <w:r>
+        <w:t>Class PilotedCraft menggunakan with Piloted untuk memperoleh properti dan method dari mixin Piloted. Program menampilkan jumlah astronaut yang dimiliki spacecraft tersebut.</w:t>
+      </w:r>
+    </w:p>
+    <w:p>
+      <w:r>
+        <w:t>File: tes16.dart</w:t>
+      </w:r>
+    </w:p>
+    <w:p>
+      <w:pPr>
+        <w:rPr>
+          <w:lang w:val="en-ID"/>
+        </w:rPr>
+      </w:pPr>
+      <w:r>
+        <w:rPr>
+          <w:noProof/>
+          <w:lang w:val="en-ID"/>
+        </w:rPr>
+        <w:drawing>
+          <wp:inline distT="0" distB="0" distL="0" distR="0" wp14:anchorId="646D43BA" wp14:editId="259CABDE">
+            <wp:extent cx="5731510" cy="5346065"/>
+            <wp:effectExtent l="0" t="0" r="2540" b="6985"/>
+            <wp:docPr id="479528822" name="Picture 1"/>
+            <wp:cNvGraphicFramePr>
+              <a:graphicFrameLocks xmlns:a="http://schemas.openxmlformats.org/drawingml/2006/main" noChangeAspect="1"/>
+            </wp:cNvGraphicFramePr>
+            <a:graphic xmlns:a="http://schemas.openxmlformats.org/drawingml/2006/main">
+              <a:graphicData uri="http://schemas.openxmlformats.org/drawingml/2006/picture">
+                <pic:pic xmlns:pic="http://schemas.openxmlformats.org/drawingml/2006/picture">
+                  <pic:nvPicPr>
+                    <pic:cNvPr id="479528822" name=""/>
+                    <pic:cNvPicPr/>
+                  </pic:nvPicPr>
+                  <pic:blipFill>
+                    <a:blip r:embed="rId20"/>
+                    <a:stretch>
+                      <a:fillRect/>
+                    </a:stretch>
+                  </pic:blipFill>
+                  <pic:spPr>
+                    <a:xfrm>
+                      <a:off x="0" y="0"/>
+                      <a:ext cx="5731510" cy="5346065"/>
+                    </a:xfrm>
+                    <a:prstGeom prst="rect">
+                      <a:avLst/>
+                    </a:prstGeom>
+                  </pic:spPr>
+                </pic:pic>
+              </a:graphicData>
+            </a:graphic>
+          </wp:inline>
+        </w:drawing>
+      </w:r>
+    </w:p>
+    <w:p>
+      <w:pPr>
+        <w:rPr>
+          <w:lang w:val="en-ID"/>
+        </w:rPr>
+      </w:pPr>
+    </w:p>
+    <w:p>
+      <w:pPr>
+        <w:pStyle w:val="Heading2"/>
+      </w:pPr>
+      <w:r>
+        <w:t>Tes 17</w:t>
+      </w:r>
+    </w:p>
+    <w:p>
+      <w:r>
+        <w:t>Program membuat class MockSpaceship yang mengimplementasikan class Spacecraft. Class tersebut menyediakan implementasi properti dan method yang dipersyaratkan oleh interface.</w:t>
+      </w:r>
+    </w:p>
+    <w:p>
+      <w:r>
+        <w:t>File: tes17.dart</w:t>
+      </w:r>
+    </w:p>
+    <w:p>
+      <w:pPr>
+        <w:rPr>
+          <w:lang w:val="en-ID"/>
+        </w:rPr>
+      </w:pPr>
+      <w:r>
+        <w:rPr>
+          <w:noProof/>
+          <w:lang w:val="en-ID"/>
+        </w:rPr>
+        <w:drawing>
+          <wp:inline distT="0" distB="0" distL="0" distR="0" wp14:anchorId="49FE7128" wp14:editId="55D96D0E">
+            <wp:extent cx="5731510" cy="6189980"/>
+            <wp:effectExtent l="0" t="0" r="2540" b="1270"/>
+            <wp:docPr id="1143801868" name="Picture 1"/>
+            <wp:cNvGraphicFramePr>
+              <a:graphicFrameLocks xmlns:a="http://schemas.openxmlformats.org/drawingml/2006/main" noChangeAspect="1"/>
+            </wp:cNvGraphicFramePr>
+            <a:graphic xmlns:a="http://schemas.openxmlformats.org/drawingml/2006/main">
+              <a:graphicData uri="http://schemas.openxmlformats.org/drawingml/2006/picture">
+                <pic:pic xmlns:pic="http://schemas.openxmlformats.org/drawingml/2006/picture">
+                  <pic:nvPicPr>
+                    <pic:cNvPr id="1143801868" name=""/>
+                    <pic:cNvPicPr/>
+                  </pic:nvPicPr>
+                  <pic:blipFill>
+                    <a:blip r:embed="rId21"/>
+                    <a:stretch>
+                      <a:fillRect/>
+                    </a:stretch>
+                  </pic:blipFill>
+                  <pic:spPr>
+                    <a:xfrm>
+                      <a:off x="0" y="0"/>
+                      <a:ext cx="5731510" cy="6189980"/>
+                    </a:xfrm>
+                    <a:prstGeom prst="rect">
+                      <a:avLst/>
+                    </a:prstGeom>
+                  </pic:spPr>
+                </pic:pic>
+              </a:graphicData>
+            </a:graphic>
+          </wp:inline>
+        </w:drawing>
+      </w:r>
+    </w:p>
+    <w:p>
+      <w:pPr>
+        <w:rPr>
+          <w:lang w:val="en-ID"/>
+        </w:rPr>
+      </w:pPr>
+    </w:p>
+    <w:p>
+      <w:pPr>
+        <w:pStyle w:val="Heading2"/>
+      </w:pPr>
+      <w:r>
+        <w:t>Tes 18</w:t>
+      </w:r>
+    </w:p>
+    <w:p>
+      <w:r>
+        <w:t>Program membuat abstract class Describable yang memiliki method abstrak describe() dan method konkret describeWithEmphasis(). Class Starship kemudian mengimplementasikan abstract class tersebut.</w:t>
+      </w:r>
+    </w:p>
+    <w:p>
+      <w:r>
+        <w:t>File: tes18.dart</w:t>
+      </w:r>
+    </w:p>
+    <w:p>
+      <w:pPr>
+        <w:rPr>
+          <w:lang w:val="en-ID"/>
+        </w:rPr>
+      </w:pPr>
+      <w:r>
+        <w:rPr>
+          <w:noProof/>
+          <w:lang w:val="en-ID"/>
+        </w:rPr>
+        <w:drawing>
+          <wp:inline distT="0" distB="0" distL="0" distR="0" wp14:anchorId="3AB8C176" wp14:editId="3D2E7ACE">
+            <wp:extent cx="5731510" cy="5860415"/>
+            <wp:effectExtent l="0" t="0" r="2540" b="6985"/>
+            <wp:docPr id="113379791" name="Picture 1"/>
+            <wp:cNvGraphicFramePr>
+              <a:graphicFrameLocks xmlns:a="http://schemas.openxmlformats.org/drawingml/2006/main" noChangeAspect="1"/>
+            </wp:cNvGraphicFramePr>
+            <a:graphic xmlns:a="http://schemas.openxmlformats.org/drawingml/2006/main">
+              <a:graphicData uri="http://schemas.openxmlformats.org/drawingml/2006/picture">
+                <pic:pic xmlns:pic="http://schemas.openxmlformats.org/drawingml/2006/picture">
+                  <pic:nvPicPr>
+                    <pic:cNvPr id="113379791" name=""/>
+                    <pic:cNvPicPr/>
+                  </pic:nvPicPr>
+                  <pic:blipFill>
+                    <a:blip r:embed="rId22"/>
+                    <a:stretch>
+                      <a:fillRect/>
+                    </a:stretch>
+                  </pic:blipFill>
+                  <pic:spPr>
+                    <a:xfrm>
+                      <a:off x="0" y="0"/>
+                      <a:ext cx="5731510" cy="5860415"/>
+                    </a:xfrm>
+                    <a:prstGeom prst="rect">
+                      <a:avLst/>
+                    </a:prstGeom>
+                  </pic:spPr>
+                </pic:pic>
+              </a:graphicData>
+            </a:graphic>
+          </wp:inline>
+        </w:drawing>
+      </w:r>
+    </w:p>
+    <w:p>
+      <w:pPr>
+        <w:rPr>
+          <w:lang w:val="en-ID"/>
+        </w:rPr>
+      </w:pPr>
+    </w:p>
+    <w:p>
+      <w:pPr>
+        <w:pStyle w:val="Heading2"/>
+      </w:pPr>
+      <w:r>
+        <w:t>Tes 19</w:t>
+      </w:r>
+    </w:p>
+    <w:p>
+      <w:r>
+        <w:t>Program membuat fungsi printWithDelay() yang menunda proses selama satu detik menggunakan Future.delayed(). Kata kunci await digunakan untuk menunggu proses asynchronous selesai sebelum mencetak pesan.</w:t>
+      </w:r>
+    </w:p>
+    <w:p>
+      <w:r>
+        <w:t>File: tes19.dart</w:t>
+      </w:r>
+    </w:p>
+    <w:p>
+      <w:pPr>
+        <w:rPr>
+          <w:lang w:val="en-ID"/>
+        </w:rPr>
+      </w:pPr>
+      <w:r>
+        <w:rPr>
+          <w:noProof/>
+          <w:lang w:val="en-ID"/>
+        </w:rPr>
+        <w:drawing>
+          <wp:inline distT="0" distB="0" distL="0" distR="0" wp14:anchorId="1BBB246A" wp14:editId="078B5D46">
+            <wp:extent cx="5731510" cy="3836670"/>
+            <wp:effectExtent l="0" t="0" r="2540" b="0"/>
+            <wp:docPr id="1925636744" name="Picture 1"/>
+            <wp:cNvGraphicFramePr>
+              <a:graphicFrameLocks xmlns:a="http://schemas.openxmlformats.org/drawingml/2006/main" noChangeAspect="1"/>
+            </wp:cNvGraphicFramePr>
+            <a:graphic xmlns:a="http://schemas.openxmlformats.org/drawingml/2006/main">
+              <a:graphicData uri="http://schemas.openxmlformats.org/drawingml/2006/picture">
+                <pic:pic xmlns:pic="http://schemas.openxmlformats.org/drawingml/2006/picture">
+                  <pic:nvPicPr>
+                    <pic:cNvPr id="1925636744" name=""/>
+                    <pic:cNvPicPr/>
+                  </pic:nvPicPr>
+                  <pic:blipFill>
+                    <a:blip r:embed="rId23"/>
+                    <a:stretch>
+                      <a:fillRect/>
+                    </a:stretch>
+                  </pic:blipFill>
+                  <pic:spPr>
+                    <a:xfrm>
+                      <a:off x="0" y="0"/>
+                      <a:ext cx="5731510" cy="3836670"/>
+                    </a:xfrm>
+                    <a:prstGeom prst="rect">
+                      <a:avLst/>
+                    </a:prstGeom>
+                  </pic:spPr>
+                </pic:pic>
+              </a:graphicData>
+            </a:graphic>
+          </wp:inline>
+        </w:drawing>
+      </w:r>
+    </w:p>
+    <w:p>
+      <w:pPr>
+        <w:rPr>
+          <w:lang w:val="en-ID"/>
+        </w:rPr>
+      </w:pPr>
+    </w:p>
+    <w:p>
+      <w:pPr>
+        <w:pStyle w:val="Heading2"/>
+      </w:pPr>
+      <w:r>
+        <w:t>Tes 20</w:t>
+      </w:r>
+    </w:p>
+    <w:p>
+      <w:r>
+        <w:t>Program melakukan proses asynchronous seperti Tes 19, tetapi menggunakan method then() sebagai pengganti async dan await. Pesan ditampilkan setelah proses penundaan selesai.</w:t>
+      </w:r>
+    </w:p>
+    <w:p>
+      <w:r>
+        <w:t>File: tes20.dart</w:t>
+      </w:r>
+    </w:p>
+    <w:p>
+      <w:pPr>
+        <w:rPr>
+          <w:lang w:val="en-ID"/>
+        </w:rPr>
+      </w:pPr>
+      <w:r>
+        <w:rPr>
+          <w:noProof/>
+          <w:lang w:val="en-ID"/>
+        </w:rPr>
+        <w:drawing>
+          <wp:inline distT="0" distB="0" distL="0" distR="0" wp14:anchorId="67D52E70" wp14:editId="594365C4">
+            <wp:extent cx="5731510" cy="4434840"/>
+            <wp:effectExtent l="0" t="0" r="2540" b="3810"/>
+            <wp:docPr id="1293194634" name="Picture 1"/>
+            <wp:cNvGraphicFramePr>
+              <a:graphicFrameLocks xmlns:a="http://schemas.openxmlformats.org/drawingml/2006/main" noChangeAspect="1"/>
+            </wp:cNvGraphicFramePr>
+            <a:graphic xmlns:a="http://schemas.openxmlformats.org/drawingml/2006/main">
+              <a:graphicData uri="http://schemas.openxmlformats.org/drawingml/2006/picture">
+                <pic:pic xmlns:pic="http://schemas.openxmlformats.org/drawingml/2006/picture">
+                  <pic:nvPicPr>
+                    <pic:cNvPr id="1293194634" name=""/>
+                    <pic:cNvPicPr/>
+                  </pic:nvPicPr>
+                  <pic:blipFill>
+                    <a:blip r:embed="rId24"/>
+                    <a:stretch>
+                      <a:fillRect/>
+                    </a:stretch>
+                  </pic:blipFill>
+                  <pic:spPr>
+                    <a:xfrm>
+                      <a:off x="0" y="0"/>
+                      <a:ext cx="5731510" cy="4434840"/>
+                    </a:xfrm>
+                    <a:prstGeom prst="rect">
+                      <a:avLst/>
+                    </a:prstGeom>
+                  </pic:spPr>
+                </pic:pic>
+              </a:graphicData>
+            </a:graphic>
+          </wp:inline>
+        </w:drawing>
+      </w:r>
+    </w:p>
+    <w:p>
+      <w:pPr>
+        <w:rPr>
+          <w:lang w:val="en-ID"/>
+        </w:rPr>
+      </w:pPr>
+    </w:p>
+    <w:p>
+      <w:pPr>
+        <w:pStyle w:val="Heading2"/>
+      </w:pPr>
+      <w:r>
+        <w:t>Tes 21</w:t>
+      </w:r>
+    </w:p>
+    <w:p>
+      <w:r>
+        <w:t>Program membuat file deskripsi secara asynchronous menggunakan library dart:io. Program memeriksa apakah file sudah ada, membuat file baru jika belum ada, dan menangani error menggunakan try-catch.</w:t>
+      </w:r>
+    </w:p>
+    <w:p>
+      <w:r>
+        <w:t>File: tes21.dart</w:t>
+      </w:r>
+    </w:p>
+    <w:p>
+      <w:pPr>
+        <w:rPr>
+          <w:lang w:val="en-ID"/>
+        </w:rPr>
+      </w:pPr>
+      <w:r>
+        <w:rPr>
+          <w:noProof/>
+          <w:lang w:val="en-ID"/>
+        </w:rPr>
+        <w:drawing>
+          <wp:inline distT="0" distB="0" distL="0" distR="0" wp14:anchorId="01C4A7CD" wp14:editId="43B420C8">
+            <wp:extent cx="5731510" cy="3410585"/>
+            <wp:effectExtent l="0" t="0" r="2540" b="0"/>
+            <wp:docPr id="14779809" name="Picture 1"/>
+            <wp:cNvGraphicFramePr>
+              <a:graphicFrameLocks xmlns:a="http://schemas.openxmlformats.org/drawingml/2006/main" noChangeAspect="1"/>
+            </wp:cNvGraphicFramePr>
+            <a:graphic xmlns:a="http://schemas.openxmlformats.org/drawingml/2006/main">
+              <a:graphicData uri="http://schemas.openxmlformats.org/drawingml/2006/picture">
+                <pic:pic xmlns:pic="http://schemas.openxmlformats.org/drawingml/2006/picture">
+                  <pic:nvPicPr>
+                    <pic:cNvPr id="14779809" name=""/>
+                    <pic:cNvPicPr/>
+                  </pic:nvPicPr>
+                  <pic:blipFill>
+                    <a:blip r:embed="rId25"/>
+                    <a:stretch>
+                      <a:fillRect/>
+                    </a:stretch>
+                  </pic:blipFill>
+                  <pic:spPr>
+                    <a:xfrm>
+                      <a:off x="0" y="0"/>
+                      <a:ext cx="5731510" cy="3410585"/>
+                    </a:xfrm>
+                    <a:prstGeom prst="rect">
+                      <a:avLst/>
+                    </a:prstGeom>
+                  </pic:spPr>
+                </pic:pic>
+              </a:graphicData>
+            </a:graphic>
+          </wp:inline>
+        </w:drawing>
+      </w:r>
+    </w:p>
+    <w:p>
+      <w:pPr>
+        <w:rPr>
+          <w:lang w:val="en-ID"/>
+        </w:rPr>
+      </w:pPr>
+    </w:p>
+    <w:p>
+      <w:pPr>
+        <w:pStyle w:val="Heading2"/>
+      </w:pPr>
+      <w:r>
+        <w:t>Tes 22</w:t>
+      </w:r>
+    </w:p>
+    <w:p>
+      <w:r>
+        <w:t>Program menggunakan Stream&lt;String&gt; dan fungsi async* untuk menghasilkan data secara bertahap. Setiap objek yang dilewati spacecraft dikirim menggunakan yield, kemudian diterima menggunakan await for.</w:t>
+      </w:r>
+    </w:p>
+    <w:p>
+      <w:r>
+        <w:t>File: tes22.dart</w:t>
+      </w:r>
+    </w:p>
+    <w:p>
+      <w:pPr>
+        <w:rPr>
+          <w:lang w:val="en-ID"/>
+        </w:rPr>
+      </w:pPr>
+      <w:r>
+        <w:rPr>
+          <w:noProof/>
+          <w:lang w:val="en-ID"/>
+        </w:rPr>
+        <w:drawing>
+          <wp:inline distT="0" distB="0" distL="0" distR="0" wp14:anchorId="3B660D1A" wp14:editId="6A67B928">
+            <wp:extent cx="5731510" cy="4493895"/>
+            <wp:effectExtent l="0" t="0" r="2540" b="1905"/>
+            <wp:docPr id="184325452" name="Picture 1"/>
+            <wp:cNvGraphicFramePr>
+              <a:graphicFrameLocks xmlns:a="http://schemas.openxmlformats.org/drawingml/2006/main" noChangeAspect="1"/>
+            </wp:cNvGraphicFramePr>
+            <a:graphic xmlns:a="http://schemas.openxmlformats.org/drawingml/2006/main">
+              <a:graphicData uri="http://schemas.openxmlformats.org/drawingml/2006/picture">
+                <pic:pic xmlns:pic="http://schemas.openxmlformats.org/drawingml/2006/picture">
+                  <pic:nvPicPr>
+                    <pic:cNvPr id="184325452" name=""/>
+                    <pic:cNvPicPr/>
+                  </pic:nvPicPr>
+                  <pic:blipFill>
+                    <a:blip r:embed="rId26"/>
+                    <a:stretch>
+                      <a:fillRect/>
+                    </a:stretch>
+                  </pic:blipFill>
+                  <pic:spPr>
+                    <a:xfrm>
+                      <a:off x="0" y="0"/>
+                      <a:ext cx="5731510" cy="4493895"/>
+                    </a:xfrm>
+                    <a:prstGeom prst="rect">
+                      <a:avLst/>
+                    </a:prstGeom>
+                  </pic:spPr>
+                </pic:pic>
+              </a:graphicData>
+            </a:graphic>
+          </wp:inline>
+        </w:drawing>
+      </w:r>
+    </w:p>
+    <w:p>
+      <w:pPr>
+        <w:rPr>
+          <w:lang w:val="en-ID"/>
+        </w:rPr>
+      </w:pPr>
+    </w:p>
+    <w:p>
+      <w:pPr>
+        <w:pStyle w:val="Heading2"/>
+      </w:pPr>
+      <w:r>
+        <w:t>Tes 23</w:t>
+      </w:r>
+    </w:p>
+    <w:p>
+      <w:r>
+        <w:t>Program memeriksa jumlah astronaut. Jika jumlahnya nol, program melempar StateError menggunakan throw. Error tersebut kemudian ditangani menggunakan blok try-catch.</w:t>
+      </w:r>
+    </w:p>
+    <w:p>
+      <w:r>
+        <w:t>File: tes23.dart</w:t>
+      </w:r>
+    </w:p>
+    <w:p>
+      <w:pPr>
+        <w:rPr>
+          <w:lang w:val="en-ID"/>
+        </w:rPr>
+      </w:pPr>
+      <w:r>
+        <w:rPr>
+          <w:noProof/>
+          <w:lang w:val="en-ID"/>
+        </w:rPr>
+        <w:drawing>
+          <wp:inline distT="0" distB="0" distL="0" distR="0" wp14:anchorId="6EA94C13" wp14:editId="4E0BED47">
+            <wp:extent cx="5731510" cy="4725670"/>
+            <wp:effectExtent l="0" t="0" r="2540" b="0"/>
+            <wp:docPr id="1878661786" name="Picture 1"/>
+            <wp:cNvGraphicFramePr>
+              <a:graphicFrameLocks xmlns:a="http://schemas.openxmlformats.org/drawingml/2006/main" noChangeAspect="1"/>
+            </wp:cNvGraphicFramePr>
+            <a:graphic xmlns:a="http://schemas.openxmlformats.org/drawingml/2006/main">
+              <a:graphicData uri="http://schemas.openxmlformats.org/drawingml/2006/picture">
+                <pic:pic xmlns:pic="http://schemas.openxmlformats.org/drawingml/2006/picture">
+                  <pic:nvPicPr>
+                    <pic:cNvPr id="1878661786" name=""/>
+                    <pic:cNvPicPr/>
+                  </pic:nvPicPr>
+                  <pic:blipFill>
+                    <a:blip r:embed="rId27"/>
+                    <a:stretch>
+                      <a:fillRect/>
+                    </a:stretch>
+                  </pic:blipFill>
+                  <pic:spPr>
+                    <a:xfrm>
+                      <a:off x="0" y="0"/>
+                      <a:ext cx="5731510" cy="4725670"/>
+                    </a:xfrm>
+                    <a:prstGeom prst="rect">
+                      <a:avLst/>
+                    </a:prstGeom>
+                  </pic:spPr>
+                </pic:pic>
+              </a:graphicData>
+            </a:graphic>
+          </wp:inline>
+        </w:drawing>
+      </w:r>
+    </w:p>
+    <w:p>
+      <w:pPr>
+        <w:rPr>
+          <w:lang w:val="en-ID"/>
+        </w:rPr>
+      </w:pPr>
+    </w:p>
+    <w:p>
+      <w:pPr>
+        <w:pStyle w:val="Heading2"/>
+      </w:pPr>
+      <w:r>
+        <w:t>Tes 24</w:t>
+      </w:r>
+    </w:p>
+    <w:p>
+      <w:r>
+        <w:t>Program membaca isi file deskripsi menggunakan operasi asynchronous. Jika terjadi kesalahan input/output, error ditangani melalui IOException. Blok finally digunakan untuk mengosongkan daftar objek dan membersihkan file sementara setelah proses selesai.</w:t>
+      </w:r>
+    </w:p>
+    <w:p>
+      <w:r>
+        <w:t>File: tes24.dart</w:t>
+      </w:r>
+    </w:p>
+    <w:p>
+      <w:pPr>
+        <w:rPr>
+          <w:lang w:val="en-ID"/>
+        </w:rPr>
+      </w:pPr>
+      <w:r>
+        <w:rPr>
+          <w:noProof/>
+          <w:lang w:val="en-ID"/>
+        </w:rPr>
+        <w:drawing>
+          <wp:inline distT="0" distB="0" distL="0" distR="0" wp14:anchorId="5FA171F5" wp14:editId="3F74B3A0">
+            <wp:extent cx="5731510" cy="3854450"/>
+            <wp:effectExtent l="0" t="0" r="2540" b="0"/>
+            <wp:docPr id="1208096979" name="Picture 1"/>
+            <wp:cNvGraphicFramePr>
+              <a:graphicFrameLocks xmlns:a="http://schemas.openxmlformats.org/drawingml/2006/main" noChangeAspect="1"/>
+            </wp:cNvGraphicFramePr>
+            <a:graphic xmlns:a="http://schemas.openxmlformats.org/drawingml/2006/main">
+              <a:graphicData uri="http://schemas.openxmlformats.org/drawingml/2006/picture">
+                <pic:pic xmlns:pic="http://schemas.openxmlformats.org/drawingml/2006/picture">
+                  <pic:nvPicPr>
+                    <pic:cNvPr id="1208096979" name=""/>
+                    <pic:cNvPicPr/>
+                  </pic:nvPicPr>
+                  <pic:blipFill>
+                    <a:blip r:embed="rId28"/>
+                    <a:stretch>
+                      <a:fillRect/>
+                    </a:stretch>
+                  </pic:blipFill>
+                  <pic:spPr>
+                    <a:xfrm>
+                      <a:off x="0" y="0"/>
+                      <a:ext cx="5731510" cy="3854450"/>
+                    </a:xfrm>
+                    <a:prstGeom prst="rect">
+                      <a:avLst/>
+                    </a:prstGeom>
+                  </pic:spPr>
+                </pic:pic>
+              </a:graphicData>
+            </a:graphic>
+          </wp:inline>
+        </w:drawing>
+      </w:r>
+    </w:p>
     <w:sectPr>
       <w:pgSz w:w="11906" w:h="16838"/>
       <w:pgMar w:top="1440" w:right="1440" w:bottom="1440" w:left="1440" w:header="708" w:footer="708" w:gutter="0"/>
@@ -309,7 +2262,92 @@
 </w:document>
 </file>
 
-<file path=word/styles.xml><?xml version="1.0" encoding="utf-8"?>
+<file path=word\fontTable.xml><?xml version="1.0" encoding="utf-8"?>
+<w:fonts xmlns:mc="http://schemas.openxmlformats.org/markup-compatibility/2006" xmlns:r="http://schemas.openxmlformats.org/officeDocument/2006/relationships" xmlns:w="http://schemas.openxmlformats.org/wordprocessingml/2006/main" xmlns:w14="http://schemas.microsoft.com/office/word/2010/wordml" xmlns:w15="http://schemas.microsoft.com/office/word/2012/wordml" xmlns:w16cex="http://schemas.microsoft.com/office/word/2018/wordml/cex" xmlns:w16cid="http://schemas.microsoft.com/office/word/2016/wordml/cid" xmlns:w16="http://schemas.microsoft.com/office/word/2018/wordml" xmlns:w16du="http://schemas.microsoft.com/office/word/2023/wordml/word16du" xmlns:w16sdtdh="http://schemas.microsoft.com/office/word/2020/wordml/sdtdatahash" xmlns:w16sdtfl="http://schemas.microsoft.com/office/word/2024/wordml/sdtformatlock" xmlns:w16se="http://schemas.microsoft.com/office/word/2015/wordml/symex" mc:Ignorable="w14 w15 w16se w16cid w16 w16cex w16sdtdh w16sdtfl w16du">
+  <w:font w:name="Calibri">
+    <w:panose1 w:val="020F0502020204030204"/>
+    <w:charset w:val="00"/>
+    <w:family w:val="swiss"/>
+    <w:pitch w:val="variable"/>
+    <w:sig w:usb0="E4002EFF" w:usb1="C200247B" w:usb2="00000009" w:usb3="00000000" w:csb0="000001FF" w:csb1="00000000"/>
+  </w:font>
+  <w:font w:name="Times New Roman">
+    <w:panose1 w:val="02020603050405020304"/>
+    <w:charset w:val="00"/>
+    <w:family w:val="roman"/>
+    <w:pitch w:val="variable"/>
+    <w:sig w:usb0="E0002EFF" w:usb1="C000785B" w:usb2="00000009" w:usb3="00000000" w:csb0="000001FF" w:csb1="00000000"/>
+  </w:font>
+  <w:font w:name="Calibri Light">
+    <w:panose1 w:val="020F0302020204030204"/>
+    <w:charset w:val="00"/>
+    <w:family w:val="swiss"/>
+    <w:pitch w:val="variable"/>
+    <w:sig w:usb0="E4002EFF" w:usb1="C200247B" w:usb2="00000009" w:usb3="00000000" w:csb0="000001FF" w:csb1="00000000"/>
+  </w:font>
+</w:fonts>
+</file>
+
+<file path=word\settings.xml><?xml version="1.0" encoding="utf-8"?>
+<w:settings xmlns:mc="http://schemas.openxmlformats.org/markup-compatibility/2006" xmlns:o="urn:schemas-microsoft-com:office:office" xmlns:r="http://schemas.openxmlformats.org/officeDocument/2006/relationships" xmlns:m="http://schemas.openxmlformats.org/officeDocument/2006/math" xmlns:v="urn:schemas-microsoft-com:vml" xmlns:w10="urn:schemas-microsoft-com:office:word" xmlns:w="http://schemas.openxmlformats.org/wordprocessingml/2006/main" xmlns:w14="http://schemas.microsoft.com/office/word/2010/wordml" xmlns:w15="http://schemas.microsoft.com/office/word/2012/wordml" xmlns:w16cex="http://schemas.microsoft.com/office/word/2018/wordml/cex" xmlns:w16cid="http://schemas.microsoft.com/office/word/2016/wordml/cid" xmlns:w16="http://schemas.microsoft.com/office/word/2018/wordml" xmlns:w16du="http://schemas.microsoft.com/office/word/2023/wordml/word16du" xmlns:w16sdtdh="http://schemas.microsoft.com/office/word/2020/wordml/sdtdatahash" xmlns:w16sdtfl="http://schemas.microsoft.com/office/word/2024/wordml/sdtformatlock" xmlns:w16se="http://schemas.microsoft.com/office/word/2015/wordml/symex" xmlns:sl="http://schemas.openxmlformats.org/schemaLibrary/2006/main" mc:Ignorable="w14 w15 w16se w16cid w16 w16cex w16sdtdh w16sdtfl w16du">
+  <w:zoom w:percent="130"/>
+  <w:proofState w:spelling="clean" w:grammar="clean"/>
+  <w:defaultTabStop w:val="720"/>
+  <w:characterSpacingControl w:val="doNotCompress"/>
+  <w:compat>
+    <w:compatSetting w:name="compatibilityMode" w:uri="http://schemas.microsoft.com/office/word" w:val="15"/>
+    <w:compatSetting w:name="overrideTableStyleFontSizeAndJustification" w:uri="http://schemas.microsoft.com/office/word" w:val="1"/>
+    <w:compatSetting w:name="enableOpenTypeFeatures" w:uri="http://schemas.microsoft.com/office/word" w:val="1"/>
+    <w:compatSetting w:name="doNotFlipMirrorIndents" w:uri="http://schemas.microsoft.com/office/word" w:val="1"/>
+    <w:compatSetting w:name="differentiateMultirowTableHeaders" w:uri="http://schemas.microsoft.com/office/word" w:val="1"/>
+    <w:compatSetting w:name="useWord2013TrackBottomHyphenation" w:uri="http://schemas.microsoft.com/office/word" w:val="0"/>
+  </w:compat>
+  <w:rsids>
+    <w:rsidRoot w:val="006B6332"/>
+    <w:rsid w:val="000A0730"/>
+    <w:rsid w:val="001C219E"/>
+    <w:rsid w:val="00216DD8"/>
+    <w:rsid w:val="00263D8D"/>
+    <w:rsid w:val="003F0E6A"/>
+    <w:rsid w:val="00443264"/>
+    <w:rsid w:val="00681F56"/>
+    <w:rsid w:val="006B6332"/>
+    <w:rsid w:val="00842E8B"/>
+    <w:rsid w:val="00C04452"/>
+    <w:rsid w:val="00D56B4F"/>
+    <w:rsid w:val="00E43E78"/>
+    <w:rsid w:val="00FE5BDE"/>
+  </w:rsids>
+  <m:mathPr>
+    <m:mathFont m:val="Cambria Math"/>
+    <m:brkBin m:val="before"/>
+    <m:brkBinSub m:val="--"/>
+    <m:smallFrac m:val="0"/>
+    <m:dispDef/>
+    <m:lMargin m:val="0"/>
+    <m:rMargin m:val="0"/>
+    <m:defJc m:val="centerGroup"/>
+    <m:wrapIndent m:val="1440"/>
+    <m:intLim m:val="subSup"/>
+    <m:naryLim m:val="undOvr"/>
+  </m:mathPr>
+  <w:themeFontLang w:val="en-ID"/>
+  <w:clrSchemeMapping w:bg1="light1" w:t1="dark1" w:bg2="light2" w:t2="dark2" w:accent1="accent1" w:accent2="accent2" w:accent3="accent3" w:accent4="accent4" w:accent5="accent5" w:accent6="accent6" w:hyperlink="hyperlink" w:followedHyperlink="followedHyperlink"/>
+  <w:shapeDefaults>
+    <o:shapedefaults v:ext="edit" spidmax="1026"/>
+    <o:shapelayout v:ext="edit">
+      <o:idmap v:ext="edit" data="1"/>
+    </o:shapelayout>
+  </w:shapeDefaults>
+  <w:decimalSymbol w:val="."/>
+  <w:listSeparator w:val=","/>
+  <w14:docId w14:val="2F6DF20E"/>
+  <w15:chartTrackingRefBased/>
+  <w15:docId w15:val="{0B7A794E-5B0C-4C70-92B3-26F90AFAB2B0}"/>
+</w:settings>
+</file>
+
+<file path=word\styles.xml><?xml version="1.0" encoding="utf-8"?>
 <w:styles xmlns:mc="http://schemas.openxmlformats.org/markup-compatibility/2006" xmlns:r="http://schemas.openxmlformats.org/officeDocument/2006/relationships" xmlns:w="http://schemas.openxmlformats.org/wordprocessingml/2006/main" xmlns:w14="http://schemas.microsoft.com/office/word/2010/wordml" xmlns:w15="http://schemas.microsoft.com/office/word/2012/wordml" xmlns:w16cex="http://schemas.microsoft.com/office/word/2018/wordml/cex" xmlns:w16cid="http://schemas.microsoft.com/office/word/2016/wordml/cid" xmlns:w16="http://schemas.microsoft.com/office/word/2018/wordml" xmlns:w16du="http://schemas.microsoft.com/office/word/2023/wordml/word16du" xmlns:w16sdtdh="http://schemas.microsoft.com/office/word/2020/wordml/sdtdatahash" xmlns:w16sdtfl="http://schemas.microsoft.com/office/word/2024/wordml/sdtformatlock" xmlns:w16se="http://schemas.microsoft.com/office/word/2015/wordml/symex" mc:Ignorable="w14 w15 w16se w16cid w16 w16cex w16sdtdh w16sdtfl w16du">
   <w:docDefaults>
     <w:rPrDefault>
@@ -751,7 +2789,6 @@
     <w:next w:val="Normal"/>
     <w:link w:val="Heading2Char"/>
     <w:uiPriority w:val="9"/>
-    <w:semiHidden/>
     <w:unhideWhenUsed/>
     <w:qFormat/>
     <w:rsid w:val="006B6332"/>
@@ -998,7 +3035,6 @@
     <w:basedOn w:val="DefaultParagraphFont"/>
     <w:link w:val="Heading2"/>
     <w:uiPriority w:val="9"/>
-    <w:semiHidden/>
     <w:rsid w:val="006B6332"/>
     <w:rPr>
       <w:rFonts w:asciiTheme="majorHAnsi" w:eastAsiaTheme="majorEastAsia" w:hAnsiTheme="majorHAnsi" w:cstheme="majorBidi"/>
@@ -1322,7 +3358,7 @@
 </w:styles>
 </file>
 
-<file path=word/theme/theme1.xml><?xml version="1.0" encoding="utf-8"?>
+<file path=word\theme\theme1.xml><?xml version="1.0" encoding="utf-8"?>
 <a:theme xmlns:a="http://schemas.openxmlformats.org/drawingml/2006/main" name="Tema Office">
   <a:themeElements>
     <a:clrScheme name="Office">
@@ -1615,4 +3651,11 @@
     </a:ext>
   </a:extLst>
 </a:theme>
+</file>
+
+<file path=word\webSettings.xml><?xml version="1.0" encoding="utf-8"?>
+<w:webSettings xmlns:mc="http://schemas.openxmlformats.org/markup-compatibility/2006" xmlns:r="http://schemas.openxmlformats.org/officeDocument/2006/relationships" xmlns:w="http://schemas.openxmlformats.org/wordprocessingml/2006/main" xmlns:w14="http://schemas.microsoft.com/office/word/2010/wordml" xmlns:w15="http://schemas.microsoft.com/office/word/2012/wordml" xmlns:w16cex="http://schemas.microsoft.com/office/word/2018/wordml/cex" xmlns:w16cid="http://schemas.microsoft.com/office/word/2016/wordml/cid" xmlns:w16="http://schemas.microsoft.com/office/word/2018/wordml" xmlns:w16du="http://schemas.microsoft.com/office/word/2023/wordml/word16du" xmlns:w16sdtdh="http://schemas.microsoft.com/office/word/2020/wordml/sdtdatahash" xmlns:w16sdtfl="http://schemas.microsoft.com/office/word/2024/wordml/sdtformatlock" xmlns:w16se="http://schemas.microsoft.com/office/word/2015/wordml/symex" mc:Ignorable="w14 w15 w16se w16cid w16 w16cex w16sdtdh w16sdtfl w16du">
+  <w:optimizeForBrowser/>
+  <w:allowPNG/>
+</w:webSettings>
 </file>
</xml_diff>